<commit_message>
Restaurar margen derecho en la tabla Recomendaciones (texto pegado al borde)
El ajuste anterior (PR #19) puso a 0 el margen de celda izquierdo Y
derecho (tcMar) de la tabla Recomendaciones para igualar el espacio de
la numeración con la tabla Hallazgos, pero esa tabla nunca tuvo un
w:ind con margen derecho en sus párrafos (a diferencia de Hallazgos,
que sí trae w:right="131"). Resultado: sin margen de celda NI margen de
párrafo por el lado derecho, el texto quedaba pegado al borde derecho
de la celda.

Se agrega w:right="131" al w:ind de las 12 filas molde de la tabla
Recomendaciones, igual que ya tiene la tabla Hallazgos -- el margen de
celda sigue en 0 (necesario para el espaciado de la numeración a la
izquierda), pero ahora el propio párrafo aporta el margen derecho que
faltaba.

Co-Authored-By: Claude Sonnet 5 <noreply@anthropic.com>
Claude-Session: https://claude.ai/code/session_01Cu3g7hFxThiRvabaVjDM4F
</commit_message>
<xml_diff>
--- a/plantilla_base.docx
+++ b/plantilla_base.docx
@@ -2922,7 +2922,7 @@
                 <w:ilvl w:val="0"/>
                 <w:numId w:val="11"/>
               </w:numPr>
-              <w:ind w:left="568" w:hanging="425"/>
+              <w:ind w:left="568" w:right="131" w:hanging="425"/>
               <w:jc w:val="both"/>
               <w:rPr>
                 <w:rFonts w:ascii="Cambria" w:hAnsi="Cambria" w:cs="Arial"/>
@@ -3039,7 +3039,7 @@
                 <w:ilvl w:val="0"/>
                 <w:numId w:val="13"/>
               </w:numPr>
-              <w:ind w:left="568" w:hanging="425"/>
+              <w:ind w:left="568" w:right="131" w:hanging="425"/>
               <w:jc w:val="both"/>
               <w:rPr>
                 <w:rFonts w:ascii="Cambria" w:hAnsi="Cambria" w:cs="Arial"/>
@@ -3156,7 +3156,7 @@
                 <w:ilvl w:val="0"/>
                 <w:numId w:val="14"/>
               </w:numPr>
-              <w:ind w:left="568" w:hanging="425"/>
+              <w:ind w:left="568" w:right="131" w:hanging="425"/>
               <w:jc w:val="both"/>
               <w:rPr>
                 <w:rFonts w:ascii="Cambria" w:hAnsi="Cambria" w:cs="Arial"/>
@@ -3273,7 +3273,7 @@
                 <w:ilvl w:val="0"/>
                 <w:numId w:val="15"/>
               </w:numPr>
-              <w:ind w:left="568" w:hanging="425"/>
+              <w:ind w:left="568" w:right="131" w:hanging="425"/>
               <w:jc w:val="both"/>
               <w:rPr>
                 <w:rFonts w:ascii="Cambria" w:hAnsi="Cambria" w:cs="Arial"/>
@@ -3390,7 +3390,7 @@
                 <w:ilvl w:val="0"/>
                 <w:numId w:val="16"/>
               </w:numPr>
-              <w:ind w:left="568" w:hanging="425"/>
+              <w:ind w:left="568" w:right="131" w:hanging="425"/>
               <w:jc w:val="both"/>
               <w:rPr>
                 <w:rFonts w:ascii="Cambria" w:hAnsi="Cambria" w:cs="Arial"/>
@@ -3507,7 +3507,7 @@
                 <w:ilvl w:val="0"/>
                 <w:numId w:val="17"/>
               </w:numPr>
-              <w:ind w:left="568" w:hanging="425"/>
+              <w:ind w:left="568" w:right="131" w:hanging="425"/>
               <w:jc w:val="both"/>
               <w:rPr>
                 <w:rFonts w:ascii="Cambria" w:hAnsi="Cambria" w:cs="Arial"/>
@@ -3624,7 +3624,7 @@
                 <w:ilvl w:val="0"/>
                 <w:numId w:val="18"/>
               </w:numPr>
-              <w:ind w:left="568" w:hanging="425"/>
+              <w:ind w:left="568" w:right="131" w:hanging="425"/>
               <w:jc w:val="both"/>
               <w:rPr>
                 <w:rFonts w:ascii="Cambria" w:hAnsi="Cambria" w:cs="Arial"/>
@@ -3742,7 +3742,7 @@
                 <w:ilvl w:val="0"/>
                 <w:numId w:val="19"/>
               </w:numPr>
-              <w:ind w:left="568" w:hanging="425"/>
+              <w:ind w:left="568" w:right="131" w:hanging="425"/>
               <w:jc w:val="both"/>
               <w:rPr>
                 <w:rFonts w:ascii="Cambria" w:hAnsi="Cambria" w:cs="Arial"/>
@@ -3859,7 +3859,7 @@
                 <w:ilvl w:val="0"/>
                 <w:numId w:val="20"/>
               </w:numPr>
-              <w:ind w:left="568" w:hanging="425"/>
+              <w:ind w:left="568" w:right="131" w:hanging="425"/>
               <w:jc w:val="both"/>
               <w:rPr>
                 <w:rFonts w:ascii="Cambria" w:hAnsi="Cambria" w:cs="Arial"/>
@@ -3976,7 +3976,7 @@
                 <w:ilvl w:val="0"/>
                 <w:numId w:val="21"/>
               </w:numPr>
-              <w:ind w:left="568" w:hanging="425"/>
+              <w:ind w:left="568" w:right="131" w:hanging="425"/>
               <w:jc w:val="both"/>
               <w:rPr>
                 <w:rFonts w:ascii="Cambria" w:hAnsi="Cambria" w:cs="Arial"/>
@@ -4093,7 +4093,7 @@
                 <w:ilvl w:val="0"/>
                 <w:numId w:val="22"/>
               </w:numPr>
-              <w:ind w:left="568" w:hanging="425"/>
+              <w:ind w:left="568" w:right="131" w:hanging="425"/>
               <w:jc w:val="both"/>
               <w:rPr>
                 <w:rFonts w:ascii="Cambria" w:hAnsi="Cambria" w:cs="Arial"/>
@@ -4210,7 +4210,7 @@
                 <w:ilvl w:val="0"/>
                 <w:numId w:val="23"/>
               </w:numPr>
-              <w:ind w:left="568" w:hanging="425"/>
+              <w:ind w:left="568" w:right="131" w:hanging="425"/>
               <w:jc w:val="both"/>
               <w:rPr>
                 <w:rFonts w:ascii="Cambria" w:hAnsi="Cambria" w:cs="Arial"/>

</xml_diff>